<commit_message>
feat: hoàn thiện dây chuyền sản xuất P05/P06/P10/P11 + checklist 30 ngày
Bổ sung 4 prompt còn thiếu (trước chỉ có spec trong registry, chưa có script):
- P06 build_audience_segments.py: 7 phân khúc chấm điểm từ 2,567 comment thật
- P10 build_seo_packages.py: 24 gói SEO (5 title + mô tả 150-200 từ + 20 tag)
- P11 build_thumbnail_concepts.py: 72 concept + prompt AI + design brief
- P05 build_repurpose_packages.py: 120 asset + EDITOR_HANDOFF cho editor
- build_production_checklist.py: 30 ngày, 2 ngày/1 video long, 4 mốc kiểm tra

Hạ tầng:
- Bật Apify MCP (thiếu APIFY_TOKEN trong .env) + scrape_comments_apify.py
- Cài last30days skill vào skills/research/
- deploy_to_cloudflare.py: ép --branch main (trước rơi vào preview)
- build_static_deploy.py: thêm 5 file dữ liệu mới
- build_report_hub.py: thêm nhóm dây chuyền sản xuất (40 link)
- WF23: 14 -> 19 bước, succeeded
</commit_message>
<xml_diff>
--- a/outputs/reports/AZZAM_MRBEAST_AUDIT.docx
+++ b/outputs/reports/AZZAM_MRBEAST_AUDIT.docx
@@ -61,7 +61,7 @@
         <w:rPr>
           <w:i/>
         </w:rPr>
-        <w:t>Sinh: 2026-10-02 08:14 UTC</w:t>
+        <w:t>Sinh: 2026-10-02 08:57 UTC</w:t>
       </w:r>
       <w:r>
         <w:t xml:space="preserve">  •  Kênh: </w:t>
@@ -2805,7 +2805,7 @@
         <w:rPr>
           <w:i/>
         </w:rPr>
-        <w:t>Sinh: 2026-10-02 08:14 UTC</w:t>
+        <w:t>Sinh: 2026-10-02 08:57 UTC</w:t>
       </w:r>
       <w:r>
         <w:t xml:space="preserve">  •  Kênh: @azzammastertradinggold</w:t>
@@ -5661,7 +5661,7 @@
         <w:rPr>
           <w:i/>
         </w:rPr>
-        <w:t>Sinh: 2026-10-02 08:14 UTC</w:t>
+        <w:t>Sinh: 2026-10-02 08:57 UTC</w:t>
       </w:r>
       <w:r>
         <w:t xml:space="preserve">  •  Kênh: @azzammastertradinggold  •  Ngôn ngữ: ENGLISH</w:t>
@@ -8386,7 +8386,7 @@
         <w:rPr>
           <w:i/>
         </w:rPr>
-        <w:t>Sinh: 2026-10-02 08:14 UTC</w:t>
+        <w:t>Sinh: 2026-10-02 08:57 UTC</w:t>
       </w:r>
     </w:p>
     <w:p>

</xml_diff>

<commit_message>
feat: Firecrawl MCP + báo cáo tự động cho dây chuyền sản xuất
- Cài Firecrawl MCP (27 tools) qua launcher đọc key từ .env,
  key KHÔNG lọt vào config.yaml
- telegram_reporter.py: thêm report_production_pipeline (gửi số liệu thật
  của P05/P06/P10/P11 + checklist, thiếu file thì báo ❌ rõ tên file)
- Sửa WinError 10054: retry 3 lần backoff 2s/4s, bắt cả OSError,
  không retry 4xx (lỗi logic)
- WF23: thêm bước report_production_pipeline -> 20/20 bước succeeded,
  từ mai 8:00 tự gửi vào topic EDIT
</commit_message>
<xml_diff>
--- a/outputs/reports/AZZAM_MRBEAST_AUDIT.docx
+++ b/outputs/reports/AZZAM_MRBEAST_AUDIT.docx
@@ -61,7 +61,7 @@
         <w:rPr>
           <w:i/>
         </w:rPr>
-        <w:t>Sinh: 2026-10-02 08:57 UTC</w:t>
+        <w:t>Sinh: 2026-10-02 09:13 UTC</w:t>
       </w:r>
       <w:r>
         <w:t xml:space="preserve">  •  Kênh: </w:t>
@@ -2805,7 +2805,7 @@
         <w:rPr>
           <w:i/>
         </w:rPr>
-        <w:t>Sinh: 2026-10-02 08:57 UTC</w:t>
+        <w:t>Sinh: 2026-10-02 09:13 UTC</w:t>
       </w:r>
       <w:r>
         <w:t xml:space="preserve">  •  Kênh: @azzammastertradinggold</w:t>
@@ -5661,7 +5661,7 @@
         <w:rPr>
           <w:i/>
         </w:rPr>
-        <w:t>Sinh: 2026-10-02 08:57 UTC</w:t>
+        <w:t>Sinh: 2026-10-02 09:13 UTC</w:t>
       </w:r>
       <w:r>
         <w:t xml:space="preserve">  •  Kênh: @azzammastertradinggold  •  Ngôn ngữ: ENGLISH</w:t>
@@ -8386,7 +8386,7 @@
         <w:rPr>
           <w:i/>
         </w:rPr>
-        <w:t>Sinh: 2026-10-02 08:57 UTC</w:t>
+        <w:t>Sinh: 2026-10-02 09:13 UTC</w:t>
       </w:r>
     </w:p>
     <w:p>

</xml_diff>